<commit_message>
may 4, breakage pdf
</commit_message>
<xml_diff>
--- a/documents/TOOLS AND EQUIPMENT BREAKAGE MONITORING REPOR1.docx
+++ b/documents/TOOLS AND EQUIPMENT BREAKAGE MONITORING REPOR1.docx
@@ -1,16 +1,7 @@
 
 <file path=word/document.xml><?xml version="1.0" encoding="utf-8"?>
-<w:document xmlns:wpc="http://schemas.microsoft.com/office/word/2010/wordprocessingCanvas" xmlns:cx="http://schemas.microsoft.com/office/drawing/2014/chartex" xmlns:cx1="http://schemas.microsoft.com/office/drawing/2015/9/8/chartex" xmlns:cx2="http://schemas.microsoft.com/office/drawing/2015/10/21/chartex" xmlns:cx3="http://schemas.microsoft.com/office/drawing/2016/5/9/chartex" xmlns:cx4="http://schemas.microsoft.com/office/drawing/2016/5/10/chartex" xmlns:cx5="http://schemas.microsoft.com/office/drawing/2016/5/11/chartex" xmlns:cx6="http://schemas.microsoft.com/office/drawing/2016/5/12/chartex" xmlns:cx7="http://schemas.microsoft.com/office/drawing/2016/5/13/chartex" xmlns:cx8="http://schemas.microsoft.com/office/drawing/2016/5/14/chartex" xmlns:mc="http://schemas.openxmlformats.org/markup-compatibility/2006" xmlns:aink="http://schemas.microsoft.com/office/drawing/2016/ink" xmlns:am3d="http://schemas.microsoft.com/office/drawing/2017/model3d" xmlns:o="urn:schemas-microsoft-com:office:office" xmlns:oel="http://schemas.microsoft.com/office/2019/extlst" xmlns:r="http://schemas.openxmlformats.org/officeDocument/2006/relationships" xmlns:m="http://schemas.openxmlformats.org/officeDocument/2006/math" xmlns:v="urn:schemas-microsoft-com:vml" xmlns:wp14="http://schemas.microsoft.com/office/word/2010/wordprocessingDrawing" xmlns:wp="http://schemas.openxmlformats.org/drawingml/2006/wordprocessingDrawing" xmlns:w10="urn:schemas-microsoft-com:office:word" xmlns:w="http://schemas.openxmlformats.org/wordprocessingml/2006/main" xmlns:w14="http://schemas.microsoft.com/office/word/2010/wordml" xmlns:w15="http://schemas.microsoft.com/office/word/2012/wordml" xmlns:w16cex="http://schemas.microsoft.com/office/word/2018/wordml/cex" xmlns:w16cid="http://schemas.microsoft.com/office/word/2016/wordml/cid" xmlns:w16="http://schemas.microsoft.com/office/word/2018/wordml" xmlns:w16du="http://schemas.microsoft.com/office/word/2023/wordml/word16du" xmlns:w16sdtdh="http://schemas.microsoft.com/office/word/2020/wordml/sdtdatahash" xmlns:w16sdtfl="http://schemas.microsoft.com/office/word/2024/wordml/sdtformatlock" xmlns:w16se="http://schemas.microsoft.com/office/word/2015/wordml/symex" xmlns:wpg="http://schemas.microsoft.com/office/word/2010/wordprocessingGroup" xmlns:wpi="http://schemas.microsoft.com/office/word/2010/wordprocessingInk" xmlns:wne="http://schemas.microsoft.com/office/word/2006/wordml" xmlns:wps="http://schemas.microsoft.com/office/word/2010/wordprocessingShape" mc:Ignorable="w14 w15 w16se w16cid w16 w16cex w16sdtdh w16sdtfl w16du wp14">
+<w:document xmlns:wpc="http://schemas.microsoft.com/office/word/2010/wordprocessingCanvas" xmlns:cx="http://schemas.microsoft.com/office/drawing/2014/chartex" xmlns:cx1="http://schemas.microsoft.com/office/drawing/2015/9/8/chartex" xmlns:cx2="http://schemas.microsoft.com/office/drawing/2015/10/21/chartex" xmlns:cx3="http://schemas.microsoft.com/office/drawing/2016/5/9/chartex" xmlns:cx4="http://schemas.microsoft.com/office/drawing/2016/5/10/chartex" xmlns:cx5="http://schemas.microsoft.com/office/drawing/2016/5/11/chartex" xmlns:cx6="http://schemas.microsoft.com/office/drawing/2016/5/12/chartex" xmlns:cx7="http://schemas.microsoft.com/office/drawing/2016/5/13/chartex" xmlns:cx8="http://schemas.microsoft.com/office/drawing/2016/5/14/chartex" xmlns:mc="http://schemas.openxmlformats.org/markup-compatibility/2006" xmlns:aink="http://schemas.microsoft.com/office/drawing/2016/ink" xmlns:am3d="http://schemas.microsoft.com/office/drawing/2017/model3d" xmlns:o="urn:schemas-microsoft-com:office:office" xmlns:oel="http://schemas.microsoft.com/office/2019/extlst" xmlns:r="http://schemas.openxmlformats.org/officeDocument/2006/relationships" xmlns:m="http://schemas.openxmlformats.org/officeDocument/2006/math" xmlns:v="urn:schemas-microsoft-com:vml" xmlns:wp14="http://schemas.microsoft.com/office/word/2010/wordprocessingDrawing" xmlns:wp="http://schemas.openxmlformats.org/drawingml/2006/wordprocessingDrawing" xmlns:w10="urn:schemas-microsoft-com:office:word" xmlns:w="http://schemas.openxmlformats.org/wordprocessingml/2006/main" xmlns:w14="http://schemas.microsoft.com/office/word/2010/wordml" xmlns:w15="http://schemas.microsoft.com/office/word/2012/wordml" xmlns:w16cex="http://schemas.microsoft.com/office/word/2018/wordml/cex" xmlns:w16cid="http://schemas.microsoft.com/office/word/2016/wordml/cid" xmlns:w16="http://schemas.microsoft.com/office/word/2018/wordml" xmlns:w16sdtdh="http://schemas.microsoft.com/office/word/2020/wordml/sdtdatahash" xmlns:w16se="http://schemas.microsoft.com/office/word/2015/wordml/symex" xmlns:wpg="http://schemas.microsoft.com/office/word/2010/wordprocessingGroup" xmlns:wpi="http://schemas.microsoft.com/office/word/2010/wordprocessingInk" xmlns:wne="http://schemas.microsoft.com/office/word/2006/wordml" xmlns:wps="http://schemas.microsoft.com/office/word/2010/wordprocessingShape" mc:Ignorable="w14 w15 w16se w16cid w16 w16cex w16sdtdh wp14">
   <w:body>
-    <w:p>
-      <w:pPr>
-        <w:rPr>
-          <w:rFonts w:ascii="Times New Roman" w:hAnsi="Times New Roman" w:cs="Times New Roman"/>
-          <w:b/>
-          <w:bCs/>
-        </w:rPr>
-      </w:pPr>
-    </w:p>
     <w:p>
       <w:pPr>
         <w:jc w:val="center"/>
@@ -1297,42 +1288,6 @@
     </w:p>
     <w:p>
       <w:pPr>
-        <w:rPr>
-          <w:rFonts w:ascii="Times New Roman" w:hAnsi="Times New Roman" w:cs="Times New Roman"/>
-          <w:b/>
-          <w:bCs/>
-        </w:rPr>
-      </w:pPr>
-    </w:p>
-    <w:p>
-      <w:pPr>
-        <w:rPr>
-          <w:rFonts w:ascii="Times New Roman" w:hAnsi="Times New Roman" w:cs="Times New Roman"/>
-          <w:b/>
-          <w:bCs/>
-        </w:rPr>
-      </w:pPr>
-    </w:p>
-    <w:p>
-      <w:pPr>
-        <w:rPr>
-          <w:rFonts w:ascii="Times New Roman" w:hAnsi="Times New Roman" w:cs="Times New Roman"/>
-          <w:b/>
-          <w:bCs/>
-        </w:rPr>
-      </w:pPr>
-    </w:p>
-    <w:p>
-      <w:pPr>
-        <w:rPr>
-          <w:rFonts w:ascii="Times New Roman" w:hAnsi="Times New Roman" w:cs="Times New Roman"/>
-          <w:b/>
-          <w:bCs/>
-        </w:rPr>
-      </w:pPr>
-    </w:p>
-    <w:p>
-      <w:pPr>
         <w:tabs>
           <w:tab w:val="left" w:pos="7416"/>
         </w:tabs>
@@ -1342,14 +1297,6 @@
           <w:bCs/>
         </w:rPr>
       </w:pPr>
-      <w:r>
-        <w:rPr>
-          <w:rFonts w:ascii="Times New Roman" w:hAnsi="Times New Roman" w:cs="Times New Roman"/>
-          <w:b/>
-          <w:bCs/>
-        </w:rPr>
-        <w:tab/>
-      </w:r>
     </w:p>
     <w:sectPr>
       <w:headerReference w:type="default" r:id="rId6"/>
@@ -1363,7 +1310,7 @@
 </file>
 
 <file path=word/endnotes.xml><?xml version="1.0" encoding="utf-8"?>
-<w:endnotes xmlns:wpc="http://schemas.microsoft.com/office/word/2010/wordprocessingCanvas" xmlns:cx="http://schemas.microsoft.com/office/drawing/2014/chartex" xmlns:cx1="http://schemas.microsoft.com/office/drawing/2015/9/8/chartex" xmlns:cx2="http://schemas.microsoft.com/office/drawing/2015/10/21/chartex" xmlns:cx3="http://schemas.microsoft.com/office/drawing/2016/5/9/chartex" xmlns:cx4="http://schemas.microsoft.com/office/drawing/2016/5/10/chartex" xmlns:cx5="http://schemas.microsoft.com/office/drawing/2016/5/11/chartex" xmlns:cx6="http://schemas.microsoft.com/office/drawing/2016/5/12/chartex" xmlns:cx7="http://schemas.microsoft.com/office/drawing/2016/5/13/chartex" xmlns:cx8="http://schemas.microsoft.com/office/drawing/2016/5/14/chartex" xmlns:mc="http://schemas.openxmlformats.org/markup-compatibility/2006" xmlns:aink="http://schemas.microsoft.com/office/drawing/2016/ink" xmlns:am3d="http://schemas.microsoft.com/office/drawing/2017/model3d" xmlns:o="urn:schemas-microsoft-com:office:office" xmlns:oel="http://schemas.microsoft.com/office/2019/extlst" xmlns:r="http://schemas.openxmlformats.org/officeDocument/2006/relationships" xmlns:m="http://schemas.openxmlformats.org/officeDocument/2006/math" xmlns:v="urn:schemas-microsoft-com:vml" xmlns:wp14="http://schemas.microsoft.com/office/word/2010/wordprocessingDrawing" xmlns:wp="http://schemas.openxmlformats.org/drawingml/2006/wordprocessingDrawing" xmlns:w10="urn:schemas-microsoft-com:office:word" xmlns:w="http://schemas.openxmlformats.org/wordprocessingml/2006/main" xmlns:w14="http://schemas.microsoft.com/office/word/2010/wordml" xmlns:w15="http://schemas.microsoft.com/office/word/2012/wordml" xmlns:w16cex="http://schemas.microsoft.com/office/word/2018/wordml/cex" xmlns:w16cid="http://schemas.microsoft.com/office/word/2016/wordml/cid" xmlns:w16="http://schemas.microsoft.com/office/word/2018/wordml" xmlns:w16du="http://schemas.microsoft.com/office/word/2023/wordml/word16du" xmlns:w16sdtdh="http://schemas.microsoft.com/office/word/2020/wordml/sdtdatahash" xmlns:w16sdtfl="http://schemas.microsoft.com/office/word/2024/wordml/sdtformatlock" xmlns:w16se="http://schemas.microsoft.com/office/word/2015/wordml/symex" xmlns:wpg="http://schemas.microsoft.com/office/word/2010/wordprocessingGroup" xmlns:wpi="http://schemas.microsoft.com/office/word/2010/wordprocessingInk" xmlns:wne="http://schemas.microsoft.com/office/word/2006/wordml" xmlns:wps="http://schemas.microsoft.com/office/word/2010/wordprocessingShape" mc:Ignorable="w14 w15 w16se w16cid w16 w16cex w16sdtdh w16sdtfl w16du wp14">
+<w:endnotes xmlns:wpc="http://schemas.microsoft.com/office/word/2010/wordprocessingCanvas" xmlns:cx="http://schemas.microsoft.com/office/drawing/2014/chartex" xmlns:cx1="http://schemas.microsoft.com/office/drawing/2015/9/8/chartex" xmlns:cx2="http://schemas.microsoft.com/office/drawing/2015/10/21/chartex" xmlns:cx3="http://schemas.microsoft.com/office/drawing/2016/5/9/chartex" xmlns:cx4="http://schemas.microsoft.com/office/drawing/2016/5/10/chartex" xmlns:cx5="http://schemas.microsoft.com/office/drawing/2016/5/11/chartex" xmlns:cx6="http://schemas.microsoft.com/office/drawing/2016/5/12/chartex" xmlns:cx7="http://schemas.microsoft.com/office/drawing/2016/5/13/chartex" xmlns:cx8="http://schemas.microsoft.com/office/drawing/2016/5/14/chartex" xmlns:mc="http://schemas.openxmlformats.org/markup-compatibility/2006" xmlns:aink="http://schemas.microsoft.com/office/drawing/2016/ink" xmlns:am3d="http://schemas.microsoft.com/office/drawing/2017/model3d" xmlns:o="urn:schemas-microsoft-com:office:office" xmlns:oel="http://schemas.microsoft.com/office/2019/extlst" xmlns:r="http://schemas.openxmlformats.org/officeDocument/2006/relationships" xmlns:m="http://schemas.openxmlformats.org/officeDocument/2006/math" xmlns:v="urn:schemas-microsoft-com:vml" xmlns:wp14="http://schemas.microsoft.com/office/word/2010/wordprocessingDrawing" xmlns:wp="http://schemas.openxmlformats.org/drawingml/2006/wordprocessingDrawing" xmlns:w10="urn:schemas-microsoft-com:office:word" xmlns:w="http://schemas.openxmlformats.org/wordprocessingml/2006/main" xmlns:w14="http://schemas.microsoft.com/office/word/2010/wordml" xmlns:w15="http://schemas.microsoft.com/office/word/2012/wordml" xmlns:w16cex="http://schemas.microsoft.com/office/word/2018/wordml/cex" xmlns:w16cid="http://schemas.microsoft.com/office/word/2016/wordml/cid" xmlns:w16="http://schemas.microsoft.com/office/word/2018/wordml" xmlns:w16sdtdh="http://schemas.microsoft.com/office/word/2020/wordml/sdtdatahash" xmlns:w16se="http://schemas.microsoft.com/office/word/2015/wordml/symex" xmlns:wpg="http://schemas.microsoft.com/office/word/2010/wordprocessingGroup" xmlns:wpi="http://schemas.microsoft.com/office/word/2010/wordprocessingInk" xmlns:wne="http://schemas.microsoft.com/office/word/2006/wordml" xmlns:wps="http://schemas.microsoft.com/office/word/2010/wordprocessingShape" mc:Ignorable="w14 w15 w16se w16cid w16 w16cex w16sdtdh wp14">
   <w:endnote w:type="separator" w:id="-1">
     <w:p>
       <w:pPr>
@@ -1388,7 +1335,7 @@
 </file>
 
 <file path=word/footnotes.xml><?xml version="1.0" encoding="utf-8"?>
-<w:footnotes xmlns:wpc="http://schemas.microsoft.com/office/word/2010/wordprocessingCanvas" xmlns:cx="http://schemas.microsoft.com/office/drawing/2014/chartex" xmlns:cx1="http://schemas.microsoft.com/office/drawing/2015/9/8/chartex" xmlns:cx2="http://schemas.microsoft.com/office/drawing/2015/10/21/chartex" xmlns:cx3="http://schemas.microsoft.com/office/drawing/2016/5/9/chartex" xmlns:cx4="http://schemas.microsoft.com/office/drawing/2016/5/10/chartex" xmlns:cx5="http://schemas.microsoft.com/office/drawing/2016/5/11/chartex" xmlns:cx6="http://schemas.microsoft.com/office/drawing/2016/5/12/chartex" xmlns:cx7="http://schemas.microsoft.com/office/drawing/2016/5/13/chartex" xmlns:cx8="http://schemas.microsoft.com/office/drawing/2016/5/14/chartex" xmlns:mc="http://schemas.openxmlformats.org/markup-compatibility/2006" xmlns:aink="http://schemas.microsoft.com/office/drawing/2016/ink" xmlns:am3d="http://schemas.microsoft.com/office/drawing/2017/model3d" xmlns:o="urn:schemas-microsoft-com:office:office" xmlns:oel="http://schemas.microsoft.com/office/2019/extlst" xmlns:r="http://schemas.openxmlformats.org/officeDocument/2006/relationships" xmlns:m="http://schemas.openxmlformats.org/officeDocument/2006/math" xmlns:v="urn:schemas-microsoft-com:vml" xmlns:wp14="http://schemas.microsoft.com/office/word/2010/wordprocessingDrawing" xmlns:wp="http://schemas.openxmlformats.org/drawingml/2006/wordprocessingDrawing" xmlns:w10="urn:schemas-microsoft-com:office:word" xmlns:w="http://schemas.openxmlformats.org/wordprocessingml/2006/main" xmlns:w14="http://schemas.microsoft.com/office/word/2010/wordml" xmlns:w15="http://schemas.microsoft.com/office/word/2012/wordml" xmlns:w16cex="http://schemas.microsoft.com/office/word/2018/wordml/cex" xmlns:w16cid="http://schemas.microsoft.com/office/word/2016/wordml/cid" xmlns:w16="http://schemas.microsoft.com/office/word/2018/wordml" xmlns:w16du="http://schemas.microsoft.com/office/word/2023/wordml/word16du" xmlns:w16sdtdh="http://schemas.microsoft.com/office/word/2020/wordml/sdtdatahash" xmlns:w16sdtfl="http://schemas.microsoft.com/office/word/2024/wordml/sdtformatlock" xmlns:w16se="http://schemas.microsoft.com/office/word/2015/wordml/symex" xmlns:wpg="http://schemas.microsoft.com/office/word/2010/wordprocessingGroup" xmlns:wpi="http://schemas.microsoft.com/office/word/2010/wordprocessingInk" xmlns:wne="http://schemas.microsoft.com/office/word/2006/wordml" xmlns:wps="http://schemas.microsoft.com/office/word/2010/wordprocessingShape" mc:Ignorable="w14 w15 w16se w16cid w16 w16cex w16sdtdh w16sdtfl w16du wp14">
+<w:footnotes xmlns:wpc="http://schemas.microsoft.com/office/word/2010/wordprocessingCanvas" xmlns:cx="http://schemas.microsoft.com/office/drawing/2014/chartex" xmlns:cx1="http://schemas.microsoft.com/office/drawing/2015/9/8/chartex" xmlns:cx2="http://schemas.microsoft.com/office/drawing/2015/10/21/chartex" xmlns:cx3="http://schemas.microsoft.com/office/drawing/2016/5/9/chartex" xmlns:cx4="http://schemas.microsoft.com/office/drawing/2016/5/10/chartex" xmlns:cx5="http://schemas.microsoft.com/office/drawing/2016/5/11/chartex" xmlns:cx6="http://schemas.microsoft.com/office/drawing/2016/5/12/chartex" xmlns:cx7="http://schemas.microsoft.com/office/drawing/2016/5/13/chartex" xmlns:cx8="http://schemas.microsoft.com/office/drawing/2016/5/14/chartex" xmlns:mc="http://schemas.openxmlformats.org/markup-compatibility/2006" xmlns:aink="http://schemas.microsoft.com/office/drawing/2016/ink" xmlns:am3d="http://schemas.microsoft.com/office/drawing/2017/model3d" xmlns:o="urn:schemas-microsoft-com:office:office" xmlns:oel="http://schemas.microsoft.com/office/2019/extlst" xmlns:r="http://schemas.openxmlformats.org/officeDocument/2006/relationships" xmlns:m="http://schemas.openxmlformats.org/officeDocument/2006/math" xmlns:v="urn:schemas-microsoft-com:vml" xmlns:wp14="http://schemas.microsoft.com/office/word/2010/wordprocessingDrawing" xmlns:wp="http://schemas.openxmlformats.org/drawingml/2006/wordprocessingDrawing" xmlns:w10="urn:schemas-microsoft-com:office:word" xmlns:w="http://schemas.openxmlformats.org/wordprocessingml/2006/main" xmlns:w14="http://schemas.microsoft.com/office/word/2010/wordml" xmlns:w15="http://schemas.microsoft.com/office/word/2012/wordml" xmlns:w16cex="http://schemas.microsoft.com/office/word/2018/wordml/cex" xmlns:w16cid="http://schemas.microsoft.com/office/word/2016/wordml/cid" xmlns:w16="http://schemas.microsoft.com/office/word/2018/wordml" xmlns:w16sdtdh="http://schemas.microsoft.com/office/word/2020/wordml/sdtdatahash" xmlns:w16se="http://schemas.microsoft.com/office/word/2015/wordml/symex" xmlns:wpg="http://schemas.microsoft.com/office/word/2010/wordprocessingGroup" xmlns:wpi="http://schemas.microsoft.com/office/word/2010/wordprocessingInk" xmlns:wne="http://schemas.microsoft.com/office/word/2006/wordml" xmlns:wps="http://schemas.microsoft.com/office/word/2010/wordprocessingShape" mc:Ignorable="w14 w15 w16se w16cid w16 w16cex w16sdtdh wp14">
   <w:footnote w:type="separator" w:id="-1">
     <w:p>
       <w:pPr>
@@ -1413,7 +1360,7 @@
 </file>
 
 <file path=word/header1.xml><?xml version="1.0" encoding="utf-8"?>
-<w:hdr xmlns:wpc="http://schemas.microsoft.com/office/word/2010/wordprocessingCanvas" xmlns:cx="http://schemas.microsoft.com/office/drawing/2014/chartex" xmlns:cx1="http://schemas.microsoft.com/office/drawing/2015/9/8/chartex" xmlns:cx2="http://schemas.microsoft.com/office/drawing/2015/10/21/chartex" xmlns:cx3="http://schemas.microsoft.com/office/drawing/2016/5/9/chartex" xmlns:cx4="http://schemas.microsoft.com/office/drawing/2016/5/10/chartex" xmlns:cx5="http://schemas.microsoft.com/office/drawing/2016/5/11/chartex" xmlns:cx6="http://schemas.microsoft.com/office/drawing/2016/5/12/chartex" xmlns:cx7="http://schemas.microsoft.com/office/drawing/2016/5/13/chartex" xmlns:cx8="http://schemas.microsoft.com/office/drawing/2016/5/14/chartex" xmlns:mc="http://schemas.openxmlformats.org/markup-compatibility/2006" xmlns:aink="http://schemas.microsoft.com/office/drawing/2016/ink" xmlns:am3d="http://schemas.microsoft.com/office/drawing/2017/model3d" xmlns:o="urn:schemas-microsoft-com:office:office" xmlns:oel="http://schemas.microsoft.com/office/2019/extlst" xmlns:r="http://schemas.openxmlformats.org/officeDocument/2006/relationships" xmlns:m="http://schemas.openxmlformats.org/officeDocument/2006/math" xmlns:v="urn:schemas-microsoft-com:vml" xmlns:wp14="http://schemas.microsoft.com/office/word/2010/wordprocessingDrawing" xmlns:wp="http://schemas.openxmlformats.org/drawingml/2006/wordprocessingDrawing" xmlns:w10="urn:schemas-microsoft-com:office:word" xmlns:w="http://schemas.openxmlformats.org/wordprocessingml/2006/main" xmlns:w14="http://schemas.microsoft.com/office/word/2010/wordml" xmlns:w15="http://schemas.microsoft.com/office/word/2012/wordml" xmlns:w16cex="http://schemas.microsoft.com/office/word/2018/wordml/cex" xmlns:w16cid="http://schemas.microsoft.com/office/word/2016/wordml/cid" xmlns:w16="http://schemas.microsoft.com/office/word/2018/wordml" xmlns:w16du="http://schemas.microsoft.com/office/word/2023/wordml/word16du" xmlns:w16sdtdh="http://schemas.microsoft.com/office/word/2020/wordml/sdtdatahash" xmlns:w16sdtfl="http://schemas.microsoft.com/office/word/2024/wordml/sdtformatlock" xmlns:w16se="http://schemas.microsoft.com/office/word/2015/wordml/symex" xmlns:wpg="http://schemas.microsoft.com/office/word/2010/wordprocessingGroup" xmlns:wpi="http://schemas.microsoft.com/office/word/2010/wordprocessingInk" xmlns:wne="http://schemas.microsoft.com/office/word/2006/wordml" xmlns:wps="http://schemas.microsoft.com/office/word/2010/wordprocessingShape" mc:Ignorable="w14 w15 w16se w16cid w16 w16cex w16sdtdh w16sdtfl w16du wp14">
+<w:hdr xmlns:wpc="http://schemas.microsoft.com/office/word/2010/wordprocessingCanvas" xmlns:cx="http://schemas.microsoft.com/office/drawing/2014/chartex" xmlns:cx1="http://schemas.microsoft.com/office/drawing/2015/9/8/chartex" xmlns:cx2="http://schemas.microsoft.com/office/drawing/2015/10/21/chartex" xmlns:cx3="http://schemas.microsoft.com/office/drawing/2016/5/9/chartex" xmlns:cx4="http://schemas.microsoft.com/office/drawing/2016/5/10/chartex" xmlns:cx5="http://schemas.microsoft.com/office/drawing/2016/5/11/chartex" xmlns:cx6="http://schemas.microsoft.com/office/drawing/2016/5/12/chartex" xmlns:cx7="http://schemas.microsoft.com/office/drawing/2016/5/13/chartex" xmlns:cx8="http://schemas.microsoft.com/office/drawing/2016/5/14/chartex" xmlns:mc="http://schemas.openxmlformats.org/markup-compatibility/2006" xmlns:aink="http://schemas.microsoft.com/office/drawing/2016/ink" xmlns:am3d="http://schemas.microsoft.com/office/drawing/2017/model3d" xmlns:o="urn:schemas-microsoft-com:office:office" xmlns:oel="http://schemas.microsoft.com/office/2019/extlst" xmlns:r="http://schemas.openxmlformats.org/officeDocument/2006/relationships" xmlns:m="http://schemas.openxmlformats.org/officeDocument/2006/math" xmlns:v="urn:schemas-microsoft-com:vml" xmlns:wp14="http://schemas.microsoft.com/office/word/2010/wordprocessingDrawing" xmlns:wp="http://schemas.openxmlformats.org/drawingml/2006/wordprocessingDrawing" xmlns:w10="urn:schemas-microsoft-com:office:word" xmlns:w="http://schemas.openxmlformats.org/wordprocessingml/2006/main" xmlns:w14="http://schemas.microsoft.com/office/word/2010/wordml" xmlns:w15="http://schemas.microsoft.com/office/word/2012/wordml" xmlns:w16cex="http://schemas.microsoft.com/office/word/2018/wordml/cex" xmlns:w16cid="http://schemas.microsoft.com/office/word/2016/wordml/cid" xmlns:w16="http://schemas.microsoft.com/office/word/2018/wordml" xmlns:w16sdtdh="http://schemas.microsoft.com/office/word/2020/wordml/sdtdatahash" xmlns:w16se="http://schemas.microsoft.com/office/word/2015/wordml/symex" xmlns:wpg="http://schemas.microsoft.com/office/word/2010/wordprocessingGroup" xmlns:wpi="http://schemas.microsoft.com/office/word/2010/wordprocessingInk" xmlns:wne="http://schemas.microsoft.com/office/word/2006/wordml" xmlns:wps="http://schemas.microsoft.com/office/word/2010/wordprocessingShape" mc:Ignorable="w14 w15 w16se w16cid w16 w16cex w16sdtdh wp14">
   <w:p>
     <w:pPr>
       <w:spacing w:after="0" w:line="240" w:lineRule="auto"/>
@@ -2468,7 +2415,7 @@
             </wp:anchor>
           </w:drawing>
         </mc:Choice>
-        <mc:Fallback>
+        <mc:Fallback xmlns:w16sdtfl="http://schemas.microsoft.com/office/word/2024/wordml/sdtformatlock" xmlns:w16du="http://schemas.microsoft.com/office/word/2023/wordml/word16du">
           <w:pict>
             <v:line w14:anchorId="56C1D971" id="Straight Connector 1" o:spid="_x0000_s1026" style="position:absolute;flip:y;z-index:251660288;visibility:visible;mso-wrap-style:square;mso-width-percent:0;mso-height-percent:0;mso-wrap-distance-left:9pt;mso-wrap-distance-top:0;mso-wrap-distance-right:9pt;mso-wrap-distance-bottom:0;mso-position-horizontal:absolute;mso-position-horizontal-relative:text;mso-position-vertical:absolute;mso-position-vertical-relative:text;mso-width-percent:0;mso-height-percent:0;mso-width-relative:margin;mso-height-relative:margin" from="-68.4pt,11.35pt" to="865.2pt,14.35pt" o:gfxdata="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" strokecolor="black [3200]" strokeweight="1.5pt">
               <v:stroke joinstyle="miter"/>
@@ -2487,7 +2434,7 @@
 </file>
 
 <file path=word/styles.xml><?xml version="1.0" encoding="utf-8"?>
-<w:styles xmlns:mc="http://schemas.openxmlformats.org/markup-compatibility/2006" xmlns:r="http://schemas.openxmlformats.org/officeDocument/2006/relationships" xmlns:w="http://schemas.openxmlformats.org/wordprocessingml/2006/main" xmlns:w14="http://schemas.microsoft.com/office/word/2010/wordml" xmlns:w15="http://schemas.microsoft.com/office/word/2012/wordml" xmlns:w16cex="http://schemas.microsoft.com/office/word/2018/wordml/cex" xmlns:w16cid="http://schemas.microsoft.com/office/word/2016/wordml/cid" xmlns:w16="http://schemas.microsoft.com/office/word/2018/wordml" xmlns:w16du="http://schemas.microsoft.com/office/word/2023/wordml/word16du" xmlns:w16sdtdh="http://schemas.microsoft.com/office/word/2020/wordml/sdtdatahash" xmlns:w16sdtfl="http://schemas.microsoft.com/office/word/2024/wordml/sdtformatlock" xmlns:w16se="http://schemas.microsoft.com/office/word/2015/wordml/symex" mc:Ignorable="w14 w15 w16se w16cid w16 w16cex w16sdtdh w16sdtfl w16du">
+<w:styles xmlns:mc="http://schemas.openxmlformats.org/markup-compatibility/2006" xmlns:r="http://schemas.openxmlformats.org/officeDocument/2006/relationships" xmlns:w="http://schemas.openxmlformats.org/wordprocessingml/2006/main" xmlns:w14="http://schemas.microsoft.com/office/word/2010/wordml" xmlns:w15="http://schemas.microsoft.com/office/word/2012/wordml" xmlns:w16cex="http://schemas.microsoft.com/office/word/2018/wordml/cex" xmlns:w16cid="http://schemas.microsoft.com/office/word/2016/wordml/cid" xmlns:w16="http://schemas.microsoft.com/office/word/2018/wordml" xmlns:w16sdtdh="http://schemas.microsoft.com/office/word/2020/wordml/sdtdatahash" xmlns:w16se="http://schemas.microsoft.com/office/word/2015/wordml/symex" mc:Ignorable="w14 w15 w16se w16cid w16 w16cex w16sdtdh">
   <w:docDefaults>
     <w:rPrDefault>
       <w:rPr>

</xml_diff>